<commit_message>
added collection page and functionality (add, edit, delete). Changed project structure
</commit_message>
<xml_diff>
--- a/PI231-PolozovVA__MongoDBCourseWork-2025.docx
+++ b/PI231-PolozovVA__MongoDBCourseWork-2025.docx
@@ -11332,8 +11332,6 @@
           </wp:inline>
         </w:drawing>
       </w:r>
-      <w:bookmarkStart w:id="5" w:name="_GoBack"/>
-      <w:bookmarkEnd w:id="5"/>
     </w:p>
     <w:p>
       <w:pPr>
@@ -11360,7 +11358,7 @@
       <w:pPr>
         <w:pStyle w:val="1"/>
       </w:pPr>
-      <w:bookmarkStart w:id="6" w:name="_Toc200355634"/>
+      <w:bookmarkStart w:id="5" w:name="_Toc200355634"/>
       <w:r>
         <w:lastRenderedPageBreak/>
         <w:t>5</w:t>
@@ -11374,16 +11372,763 @@
       <w:r>
         <w:t xml:space="preserve"> для ИС</w:t>
       </w:r>
+      <w:bookmarkEnd w:id="5"/>
+    </w:p>
+    <w:p>
+      <w:pPr>
+        <w:spacing w:after="0"/>
+        <w:rPr>
+          <w:rFonts w:ascii="Times New Roman" w:hAnsi="Times New Roman" w:cs="Times New Roman"/>
+          <w:sz w:val="28"/>
+          <w:szCs w:val="28"/>
+        </w:rPr>
+      </w:pPr>
+      <w:r>
+        <w:drawing>
+          <wp:inline distT="0" distB="0" distL="0" distR="0" wp14:anchorId="24F31ECE" wp14:editId="1DF17A90">
+            <wp:extent cx="6120130" cy="2802033"/>
+            <wp:effectExtent l="0" t="0" r="0" b="0"/>
+            <wp:docPr id="37" name="Рисунок 37"/>
+            <wp:cNvGraphicFramePr>
+              <a:graphicFrameLocks xmlns:a="http://schemas.openxmlformats.org/drawingml/2006/main" noChangeAspect="1"/>
+            </wp:cNvGraphicFramePr>
+            <a:graphic xmlns:a="http://schemas.openxmlformats.org/drawingml/2006/main">
+              <a:graphicData uri="http://schemas.openxmlformats.org/drawingml/2006/picture">
+                <pic:pic xmlns:pic="http://schemas.openxmlformats.org/drawingml/2006/picture">
+                  <pic:nvPicPr>
+                    <pic:cNvPr id="0" name=""/>
+                    <pic:cNvPicPr/>
+                  </pic:nvPicPr>
+                  <pic:blipFill>
+                    <a:blip r:embed="rId40"/>
+                    <a:stretch>
+                      <a:fillRect/>
+                    </a:stretch>
+                  </pic:blipFill>
+                  <pic:spPr>
+                    <a:xfrm>
+                      <a:off x="0" y="0"/>
+                      <a:ext cx="6120130" cy="2802033"/>
+                    </a:xfrm>
+                    <a:prstGeom prst="rect">
+                      <a:avLst/>
+                    </a:prstGeom>
+                  </pic:spPr>
+                </pic:pic>
+              </a:graphicData>
+            </a:graphic>
+          </wp:inline>
+        </w:drawing>
+      </w:r>
+    </w:p>
+    <w:p>
+      <w:pPr>
+        <w:spacing w:after="0"/>
+        <w:ind w:firstLine="708"/>
+        <w:jc w:val="both"/>
+        <w:rPr>
+          <w:rFonts w:ascii="Times New Roman" w:hAnsi="Times New Roman" w:cs="Times New Roman"/>
+          <w:sz w:val="28"/>
+          <w:szCs w:val="28"/>
+        </w:rPr>
+      </w:pPr>
+      <w:r>
+        <w:rPr>
+          <w:rFonts w:ascii="Times New Roman" w:hAnsi="Times New Roman" w:cs="Times New Roman"/>
+          <w:sz w:val="28"/>
+          <w:szCs w:val="28"/>
+        </w:rPr>
+        <w:t xml:space="preserve">Главная страница отображает существующие в БД коллекции с указанием кол-ва документов в них. На этой и всех остальных страницах используются стили </w:t>
+      </w:r>
+      <w:r>
+        <w:rPr>
+          <w:rFonts w:ascii="Times New Roman" w:hAnsi="Times New Roman" w:cs="Times New Roman"/>
+          <w:sz w:val="28"/>
+          <w:szCs w:val="28"/>
+          <w:lang w:val="en-US"/>
+        </w:rPr>
+        <w:t>Bootstrap</w:t>
+      </w:r>
+      <w:r>
+        <w:rPr>
+          <w:rFonts w:ascii="Times New Roman" w:hAnsi="Times New Roman" w:cs="Times New Roman"/>
+          <w:sz w:val="28"/>
+          <w:szCs w:val="28"/>
+        </w:rPr>
+        <w:t>.</w:t>
+      </w:r>
+    </w:p>
+    <w:p>
+      <w:pPr>
+        <w:spacing w:after="0"/>
+        <w:rPr>
+          <w:lang w:val="en-US"/>
+        </w:rPr>
+      </w:pPr>
+      <w:r>
+        <w:drawing>
+          <wp:inline distT="0" distB="0" distL="0" distR="0" wp14:anchorId="5EC47B3E" wp14:editId="32B8F515">
+            <wp:extent cx="6120130" cy="2411037"/>
+            <wp:effectExtent l="0" t="0" r="0" b="8890"/>
+            <wp:docPr id="38" name="Рисунок 38"/>
+            <wp:cNvGraphicFramePr>
+              <a:graphicFrameLocks xmlns:a="http://schemas.openxmlformats.org/drawingml/2006/main" noChangeAspect="1"/>
+            </wp:cNvGraphicFramePr>
+            <a:graphic xmlns:a="http://schemas.openxmlformats.org/drawingml/2006/main">
+              <a:graphicData uri="http://schemas.openxmlformats.org/drawingml/2006/picture">
+                <pic:pic xmlns:pic="http://schemas.openxmlformats.org/drawingml/2006/picture">
+                  <pic:nvPicPr>
+                    <pic:cNvPr id="0" name=""/>
+                    <pic:cNvPicPr/>
+                  </pic:nvPicPr>
+                  <pic:blipFill>
+                    <a:blip r:embed="rId41"/>
+                    <a:stretch>
+                      <a:fillRect/>
+                    </a:stretch>
+                  </pic:blipFill>
+                  <pic:spPr>
+                    <a:xfrm>
+                      <a:off x="0" y="0"/>
+                      <a:ext cx="6120130" cy="2411037"/>
+                    </a:xfrm>
+                    <a:prstGeom prst="rect">
+                      <a:avLst/>
+                    </a:prstGeom>
+                  </pic:spPr>
+                </pic:pic>
+              </a:graphicData>
+            </a:graphic>
+          </wp:inline>
+        </w:drawing>
+      </w:r>
+    </w:p>
+    <w:p>
+      <w:pPr>
+        <w:spacing w:after="0"/>
+        <w:ind w:firstLine="708"/>
+        <w:jc w:val="both"/>
+        <w:rPr>
+          <w:rFonts w:ascii="Times New Roman" w:hAnsi="Times New Roman" w:cs="Times New Roman"/>
+          <w:sz w:val="28"/>
+          <w:szCs w:val="28"/>
+        </w:rPr>
+      </w:pPr>
+      <w:r>
+        <w:rPr>
+          <w:rFonts w:ascii="Times New Roman" w:hAnsi="Times New Roman" w:cs="Times New Roman"/>
+          <w:sz w:val="28"/>
+          <w:szCs w:val="28"/>
+        </w:rPr>
+        <w:t>На странице вида</w:t>
+      </w:r>
+      <w:r>
+        <w:rPr>
+          <w:rFonts w:ascii="Times New Roman" w:hAnsi="Times New Roman" w:cs="Times New Roman"/>
+          <w:sz w:val="28"/>
+          <w:szCs w:val="28"/>
+        </w:rPr>
+        <w:t xml:space="preserve"> </w:t>
+      </w:r>
+      <w:r>
+        <w:rPr>
+          <w:rFonts w:ascii="Times New Roman" w:hAnsi="Times New Roman" w:cs="Times New Roman"/>
+          <w:sz w:val="28"/>
+          <w:szCs w:val="28"/>
+        </w:rPr>
+        <w:t>/</w:t>
+      </w:r>
+      <w:r>
+        <w:rPr>
+          <w:rFonts w:ascii="Times New Roman" w:hAnsi="Times New Roman" w:cs="Times New Roman"/>
+          <w:sz w:val="28"/>
+          <w:szCs w:val="28"/>
+          <w:lang w:val="en-US"/>
+        </w:rPr>
+        <w:t>collection</w:t>
+      </w:r>
+      <w:r>
+        <w:rPr>
+          <w:rFonts w:ascii="Times New Roman" w:hAnsi="Times New Roman" w:cs="Times New Roman"/>
+          <w:sz w:val="28"/>
+          <w:szCs w:val="28"/>
+        </w:rPr>
+        <w:t>/</w:t>
+      </w:r>
+      <w:proofErr w:type="spellStart"/>
+      <w:r>
+        <w:rPr>
+          <w:rFonts w:ascii="Times New Roman" w:hAnsi="Times New Roman" w:cs="Times New Roman"/>
+          <w:sz w:val="28"/>
+          <w:szCs w:val="28"/>
+          <w:lang w:val="en-US"/>
+        </w:rPr>
+        <w:t>collectionName</w:t>
+      </w:r>
+      <w:proofErr w:type="spellEnd"/>
+      <w:r>
+        <w:rPr>
+          <w:rFonts w:ascii="Times New Roman" w:hAnsi="Times New Roman" w:cs="Times New Roman"/>
+          <w:sz w:val="28"/>
+          <w:szCs w:val="28"/>
+        </w:rPr>
+        <w:t xml:space="preserve"> (</w:t>
+      </w:r>
+      <w:r>
+        <w:rPr>
+          <w:rFonts w:ascii="Times New Roman" w:hAnsi="Times New Roman" w:cs="Times New Roman"/>
+          <w:sz w:val="28"/>
+          <w:szCs w:val="28"/>
+        </w:rPr>
+        <w:t>с</w:t>
+      </w:r>
+      <w:r>
+        <w:rPr>
+          <w:rFonts w:ascii="Times New Roman" w:hAnsi="Times New Roman" w:cs="Times New Roman"/>
+          <w:sz w:val="28"/>
+          <w:szCs w:val="28"/>
+        </w:rPr>
+        <w:t xml:space="preserve">траница формируется </w:t>
+      </w:r>
+      <w:r>
+        <w:rPr>
+          <w:rFonts w:ascii="Times New Roman" w:hAnsi="Times New Roman" w:cs="Times New Roman"/>
+          <w:sz w:val="28"/>
+          <w:szCs w:val="28"/>
+        </w:rPr>
+        <w:t>динамически</w:t>
+      </w:r>
+      <w:r>
+        <w:rPr>
+          <w:rFonts w:ascii="Times New Roman" w:hAnsi="Times New Roman" w:cs="Times New Roman"/>
+          <w:sz w:val="28"/>
+          <w:szCs w:val="28"/>
+        </w:rPr>
+        <w:t>)</w:t>
+      </w:r>
+      <w:r>
+        <w:rPr>
+          <w:rFonts w:ascii="Times New Roman" w:hAnsi="Times New Roman" w:cs="Times New Roman"/>
+          <w:sz w:val="28"/>
+          <w:szCs w:val="28"/>
+        </w:rPr>
+        <w:t xml:space="preserve"> </w:t>
+      </w:r>
+      <w:r>
+        <w:rPr>
+          <w:rFonts w:ascii="Times New Roman" w:hAnsi="Times New Roman" w:cs="Times New Roman"/>
+          <w:sz w:val="28"/>
+          <w:szCs w:val="28"/>
+        </w:rPr>
+        <w:t>отображает</w:t>
+      </w:r>
+      <w:r>
+        <w:rPr>
+          <w:rFonts w:ascii="Times New Roman" w:hAnsi="Times New Roman" w:cs="Times New Roman"/>
+          <w:sz w:val="28"/>
+          <w:szCs w:val="28"/>
+        </w:rPr>
+        <w:t>ся</w:t>
+      </w:r>
+      <w:r>
+        <w:rPr>
+          <w:rFonts w:ascii="Times New Roman" w:hAnsi="Times New Roman" w:cs="Times New Roman"/>
+          <w:sz w:val="28"/>
+          <w:szCs w:val="28"/>
+        </w:rPr>
+        <w:t xml:space="preserve"> </w:t>
+      </w:r>
+      <w:r>
+        <w:rPr>
+          <w:rFonts w:ascii="Times New Roman" w:hAnsi="Times New Roman" w:cs="Times New Roman"/>
+          <w:sz w:val="28"/>
+          <w:szCs w:val="28"/>
+        </w:rPr>
+        <w:t>содержимое</w:t>
+      </w:r>
+      <w:r>
+        <w:rPr>
+          <w:rFonts w:ascii="Times New Roman" w:hAnsi="Times New Roman" w:cs="Times New Roman"/>
+          <w:sz w:val="28"/>
+          <w:szCs w:val="28"/>
+        </w:rPr>
+        <w:t xml:space="preserve"> </w:t>
+      </w:r>
+      <w:r>
+        <w:rPr>
+          <w:rFonts w:ascii="Times New Roman" w:hAnsi="Times New Roman" w:cs="Times New Roman"/>
+          <w:sz w:val="28"/>
+          <w:szCs w:val="28"/>
+        </w:rPr>
+        <w:t>данной коллекции.</w:t>
+      </w:r>
+    </w:p>
+    <w:p>
+      <w:pPr>
+        <w:spacing w:after="0"/>
+        <w:ind w:firstLine="708"/>
+        <w:jc w:val="both"/>
+        <w:rPr>
+          <w:rFonts w:ascii="Times New Roman" w:hAnsi="Times New Roman" w:cs="Times New Roman"/>
+          <w:sz w:val="28"/>
+          <w:szCs w:val="28"/>
+        </w:rPr>
+      </w:pPr>
+      <w:r>
+        <w:rPr>
+          <w:rFonts w:ascii="Times New Roman" w:hAnsi="Times New Roman" w:cs="Times New Roman"/>
+          <w:sz w:val="28"/>
+          <w:szCs w:val="28"/>
+        </w:rPr>
+        <w:lastRenderedPageBreak/>
+        <w:drawing>
+          <wp:inline distT="0" distB="0" distL="0" distR="0" wp14:anchorId="16B5FFBD" wp14:editId="5F20BC9E">
+            <wp:extent cx="6120130" cy="4117776"/>
+            <wp:effectExtent l="0" t="0" r="0" b="0"/>
+            <wp:docPr id="40" name="Рисунок 40"/>
+            <wp:cNvGraphicFramePr>
+              <a:graphicFrameLocks xmlns:a="http://schemas.openxmlformats.org/drawingml/2006/main" noChangeAspect="1"/>
+            </wp:cNvGraphicFramePr>
+            <a:graphic xmlns:a="http://schemas.openxmlformats.org/drawingml/2006/main">
+              <a:graphicData uri="http://schemas.openxmlformats.org/drawingml/2006/picture">
+                <pic:pic xmlns:pic="http://schemas.openxmlformats.org/drawingml/2006/picture">
+                  <pic:nvPicPr>
+                    <pic:cNvPr id="0" name=""/>
+                    <pic:cNvPicPr/>
+                  </pic:nvPicPr>
+                  <pic:blipFill>
+                    <a:blip r:embed="rId42"/>
+                    <a:stretch>
+                      <a:fillRect/>
+                    </a:stretch>
+                  </pic:blipFill>
+                  <pic:spPr>
+                    <a:xfrm>
+                      <a:off x="0" y="0"/>
+                      <a:ext cx="6120130" cy="4117776"/>
+                    </a:xfrm>
+                    <a:prstGeom prst="rect">
+                      <a:avLst/>
+                    </a:prstGeom>
+                  </pic:spPr>
+                </pic:pic>
+              </a:graphicData>
+            </a:graphic>
+          </wp:inline>
+        </w:drawing>
+      </w:r>
+    </w:p>
+    <w:p>
+      <w:pPr>
+        <w:spacing w:after="0"/>
+        <w:ind w:firstLine="708"/>
+        <w:jc w:val="both"/>
+        <w:rPr>
+          <w:rFonts w:ascii="Times New Roman" w:hAnsi="Times New Roman" w:cs="Times New Roman"/>
+          <w:sz w:val="28"/>
+          <w:szCs w:val="28"/>
+        </w:rPr>
+      </w:pPr>
+      <w:r>
+        <w:rPr>
+          <w:rFonts w:ascii="Times New Roman" w:hAnsi="Times New Roman" w:cs="Times New Roman"/>
+          <w:sz w:val="28"/>
+          <w:szCs w:val="28"/>
+        </w:rPr>
+        <w:t>На</w:t>
+      </w:r>
+      <w:r>
+        <w:rPr>
+          <w:rFonts w:ascii="Times New Roman" w:hAnsi="Times New Roman" w:cs="Times New Roman"/>
+          <w:sz w:val="28"/>
+          <w:szCs w:val="28"/>
+        </w:rPr>
+        <w:t xml:space="preserve"> </w:t>
+      </w:r>
+      <w:r>
+        <w:rPr>
+          <w:rFonts w:ascii="Times New Roman" w:hAnsi="Times New Roman" w:cs="Times New Roman"/>
+          <w:sz w:val="28"/>
+          <w:szCs w:val="28"/>
+        </w:rPr>
+        <w:t>странице</w:t>
+      </w:r>
+      <w:r>
+        <w:rPr>
+          <w:rFonts w:ascii="Times New Roman" w:hAnsi="Times New Roman" w:cs="Times New Roman"/>
+          <w:sz w:val="28"/>
+          <w:szCs w:val="28"/>
+        </w:rPr>
+        <w:t xml:space="preserve"> </w:t>
+      </w:r>
+      <w:r>
+        <w:rPr>
+          <w:rFonts w:ascii="Times New Roman" w:hAnsi="Times New Roman" w:cs="Times New Roman"/>
+          <w:sz w:val="28"/>
+          <w:szCs w:val="28"/>
+          <w:lang w:val="en-US"/>
+        </w:rPr>
+        <w:t>collections</w:t>
+      </w:r>
+      <w:r>
+        <w:rPr>
+          <w:rFonts w:ascii="Times New Roman" w:hAnsi="Times New Roman" w:cs="Times New Roman"/>
+          <w:sz w:val="28"/>
+          <w:szCs w:val="28"/>
+        </w:rPr>
+        <w:t>/</w:t>
+      </w:r>
+      <w:proofErr w:type="spellStart"/>
+      <w:r>
+        <w:rPr>
+          <w:rFonts w:ascii="Times New Roman" w:hAnsi="Times New Roman" w:cs="Times New Roman"/>
+          <w:sz w:val="28"/>
+          <w:szCs w:val="28"/>
+          <w:lang w:val="en-US"/>
+        </w:rPr>
+        <w:t>collectionName</w:t>
+      </w:r>
+      <w:proofErr w:type="spellEnd"/>
+      <w:r>
+        <w:rPr>
+          <w:rFonts w:ascii="Times New Roman" w:hAnsi="Times New Roman" w:cs="Times New Roman"/>
+          <w:sz w:val="28"/>
+          <w:szCs w:val="28"/>
+        </w:rPr>
+        <w:t>/</w:t>
+      </w:r>
+      <w:r>
+        <w:rPr>
+          <w:rFonts w:ascii="Times New Roman" w:hAnsi="Times New Roman" w:cs="Times New Roman"/>
+          <w:sz w:val="28"/>
+          <w:szCs w:val="28"/>
+          <w:lang w:val="en-US"/>
+        </w:rPr>
+        <w:t>new</w:t>
+      </w:r>
+      <w:r>
+        <w:rPr>
+          <w:rFonts w:ascii="Times New Roman" w:hAnsi="Times New Roman" w:cs="Times New Roman"/>
+          <w:sz w:val="28"/>
+          <w:szCs w:val="28"/>
+        </w:rPr>
+        <w:t xml:space="preserve"> </w:t>
+      </w:r>
+      <w:r>
+        <w:rPr>
+          <w:rFonts w:ascii="Times New Roman" w:hAnsi="Times New Roman" w:cs="Times New Roman"/>
+          <w:sz w:val="28"/>
+          <w:szCs w:val="28"/>
+        </w:rPr>
+        <w:t>расположена форма добавления нового документа в коллекцию.</w:t>
+      </w:r>
+    </w:p>
+    <w:p>
+      <w:pPr>
+        <w:spacing w:after="0"/>
+        <w:jc w:val="both"/>
+        <w:rPr>
+          <w:rFonts w:ascii="Times New Roman" w:hAnsi="Times New Roman" w:cs="Times New Roman"/>
+          <w:sz w:val="28"/>
+          <w:szCs w:val="28"/>
+          <w:lang w:val="en-US"/>
+        </w:rPr>
+      </w:pPr>
+      <w:r>
+        <w:rPr>
+          <w:rFonts w:ascii="Times New Roman" w:hAnsi="Times New Roman" w:cs="Times New Roman"/>
+          <w:sz w:val="28"/>
+          <w:szCs w:val="28"/>
+        </w:rPr>
+        <w:drawing>
+          <wp:inline distT="0" distB="0" distL="0" distR="0" wp14:anchorId="6DC48683" wp14:editId="0EFCF6D1">
+            <wp:extent cx="6120130" cy="3292831"/>
+            <wp:effectExtent l="0" t="0" r="0" b="3175"/>
+            <wp:docPr id="41" name="Рисунок 41"/>
+            <wp:cNvGraphicFramePr>
+              <a:graphicFrameLocks xmlns:a="http://schemas.openxmlformats.org/drawingml/2006/main" noChangeAspect="1"/>
+            </wp:cNvGraphicFramePr>
+            <a:graphic xmlns:a="http://schemas.openxmlformats.org/drawingml/2006/main">
+              <a:graphicData uri="http://schemas.openxmlformats.org/drawingml/2006/picture">
+                <pic:pic xmlns:pic="http://schemas.openxmlformats.org/drawingml/2006/picture">
+                  <pic:nvPicPr>
+                    <pic:cNvPr id="0" name=""/>
+                    <pic:cNvPicPr/>
+                  </pic:nvPicPr>
+                  <pic:blipFill>
+                    <a:blip r:embed="rId43"/>
+                    <a:stretch>
+                      <a:fillRect/>
+                    </a:stretch>
+                  </pic:blipFill>
+                  <pic:spPr>
+                    <a:xfrm>
+                      <a:off x="0" y="0"/>
+                      <a:ext cx="6120130" cy="3292831"/>
+                    </a:xfrm>
+                    <a:prstGeom prst="rect">
+                      <a:avLst/>
+                    </a:prstGeom>
+                  </pic:spPr>
+                </pic:pic>
+              </a:graphicData>
+            </a:graphic>
+          </wp:inline>
+        </w:drawing>
+      </w:r>
+    </w:p>
+    <w:p>
+      <w:pPr>
+        <w:spacing w:after="0"/>
+        <w:ind w:firstLine="708"/>
+        <w:jc w:val="both"/>
+        <w:rPr>
+          <w:rFonts w:ascii="Times New Roman" w:hAnsi="Times New Roman" w:cs="Times New Roman"/>
+          <w:sz w:val="28"/>
+          <w:szCs w:val="28"/>
+        </w:rPr>
+      </w:pPr>
+      <w:r>
+        <w:rPr>
+          <w:rFonts w:ascii="Times New Roman" w:hAnsi="Times New Roman" w:cs="Times New Roman"/>
+          <w:sz w:val="28"/>
+          <w:szCs w:val="28"/>
+        </w:rPr>
+        <w:t>На</w:t>
+      </w:r>
+      <w:r>
+        <w:rPr>
+          <w:rFonts w:ascii="Times New Roman" w:hAnsi="Times New Roman" w:cs="Times New Roman"/>
+          <w:sz w:val="28"/>
+          <w:szCs w:val="28"/>
+        </w:rPr>
+        <w:t xml:space="preserve"> </w:t>
+      </w:r>
+      <w:r>
+        <w:rPr>
+          <w:rFonts w:ascii="Times New Roman" w:hAnsi="Times New Roman" w:cs="Times New Roman"/>
+          <w:sz w:val="28"/>
+          <w:szCs w:val="28"/>
+        </w:rPr>
+        <w:t>странице</w:t>
+      </w:r>
+      <w:r>
+        <w:rPr>
+          <w:rFonts w:ascii="Times New Roman" w:hAnsi="Times New Roman" w:cs="Times New Roman"/>
+          <w:sz w:val="28"/>
+          <w:szCs w:val="28"/>
+        </w:rPr>
+        <w:t xml:space="preserve"> </w:t>
+      </w:r>
+      <w:r>
+        <w:rPr>
+          <w:rFonts w:ascii="Times New Roman" w:hAnsi="Times New Roman" w:cs="Times New Roman"/>
+          <w:sz w:val="28"/>
+          <w:szCs w:val="28"/>
+          <w:lang w:val="en-US"/>
+        </w:rPr>
+        <w:t>collections</w:t>
+      </w:r>
+      <w:r>
+        <w:rPr>
+          <w:rFonts w:ascii="Times New Roman" w:hAnsi="Times New Roman" w:cs="Times New Roman"/>
+          <w:sz w:val="28"/>
+          <w:szCs w:val="28"/>
+        </w:rPr>
+        <w:t>/</w:t>
+      </w:r>
+      <w:proofErr w:type="spellStart"/>
+      <w:r>
+        <w:rPr>
+          <w:rFonts w:ascii="Times New Roman" w:hAnsi="Times New Roman" w:cs="Times New Roman"/>
+          <w:sz w:val="28"/>
+          <w:szCs w:val="28"/>
+          <w:lang w:val="en-US"/>
+        </w:rPr>
+        <w:t>collectionName</w:t>
+      </w:r>
+      <w:proofErr w:type="spellEnd"/>
+      <w:r>
+        <w:rPr>
+          <w:rFonts w:ascii="Times New Roman" w:hAnsi="Times New Roman" w:cs="Times New Roman"/>
+          <w:sz w:val="28"/>
+          <w:szCs w:val="28"/>
+        </w:rPr>
+        <w:t>/</w:t>
+      </w:r>
+      <w:proofErr w:type="spellStart"/>
+      <w:r>
+        <w:rPr>
+          <w:rFonts w:ascii="Times New Roman" w:hAnsi="Times New Roman" w:cs="Times New Roman"/>
+          <w:sz w:val="28"/>
+          <w:szCs w:val="28"/>
+          <w:lang w:val="en-US"/>
+        </w:rPr>
+        <w:t>documentId</w:t>
+      </w:r>
+      <w:proofErr w:type="spellEnd"/>
+      <w:r>
+        <w:rPr>
+          <w:rFonts w:ascii="Times New Roman" w:hAnsi="Times New Roman" w:cs="Times New Roman"/>
+          <w:sz w:val="28"/>
+          <w:szCs w:val="28"/>
+        </w:rPr>
+        <w:t>/</w:t>
+      </w:r>
+      <w:r>
+        <w:rPr>
+          <w:rFonts w:ascii="Times New Roman" w:hAnsi="Times New Roman" w:cs="Times New Roman"/>
+          <w:sz w:val="28"/>
+          <w:szCs w:val="28"/>
+          <w:lang w:val="en-US"/>
+        </w:rPr>
+        <w:t>edit</w:t>
+      </w:r>
+      <w:r>
+        <w:rPr>
+          <w:rFonts w:ascii="Times New Roman" w:hAnsi="Times New Roman" w:cs="Times New Roman"/>
+          <w:sz w:val="28"/>
+          <w:szCs w:val="28"/>
+        </w:rPr>
+        <w:t xml:space="preserve"> </w:t>
+      </w:r>
+      <w:r>
+        <w:rPr>
+          <w:rFonts w:ascii="Times New Roman" w:hAnsi="Times New Roman" w:cs="Times New Roman"/>
+          <w:sz w:val="28"/>
+          <w:szCs w:val="28"/>
+        </w:rPr>
+        <w:t xml:space="preserve">расположена форма </w:t>
+      </w:r>
+      <w:r>
+        <w:rPr>
+          <w:rFonts w:ascii="Times New Roman" w:hAnsi="Times New Roman" w:cs="Times New Roman"/>
+          <w:sz w:val="28"/>
+          <w:szCs w:val="28"/>
+        </w:rPr>
+        <w:t>для изменения существующего документа</w:t>
+      </w:r>
+      <w:r>
+        <w:rPr>
+          <w:rFonts w:ascii="Times New Roman" w:hAnsi="Times New Roman" w:cs="Times New Roman"/>
+          <w:sz w:val="28"/>
+          <w:szCs w:val="28"/>
+        </w:rPr>
+        <w:t>.</w:t>
+      </w:r>
+    </w:p>
+    <w:p>
+      <w:pPr>
+        <w:spacing w:after="0"/>
+        <w:jc w:val="both"/>
+        <w:rPr>
+          <w:rFonts w:ascii="Times New Roman" w:hAnsi="Times New Roman" w:cs="Times New Roman"/>
+          <w:sz w:val="28"/>
+          <w:szCs w:val="28"/>
+        </w:rPr>
+      </w:pPr>
+      <w:r>
+        <w:rPr>
+          <w:rFonts w:ascii="Times New Roman" w:hAnsi="Times New Roman" w:cs="Times New Roman"/>
+          <w:sz w:val="28"/>
+          <w:szCs w:val="28"/>
+        </w:rPr>
+        <w:lastRenderedPageBreak/>
+        <w:drawing>
+          <wp:inline distT="0" distB="0" distL="0" distR="0" wp14:anchorId="57F4DA59" wp14:editId="172211C5">
+            <wp:extent cx="6120130" cy="2875937"/>
+            <wp:effectExtent l="0" t="0" r="0" b="635"/>
+            <wp:docPr id="42" name="Рисунок 42"/>
+            <wp:cNvGraphicFramePr>
+              <a:graphicFrameLocks xmlns:a="http://schemas.openxmlformats.org/drawingml/2006/main" noChangeAspect="1"/>
+            </wp:cNvGraphicFramePr>
+            <a:graphic xmlns:a="http://schemas.openxmlformats.org/drawingml/2006/main">
+              <a:graphicData uri="http://schemas.openxmlformats.org/drawingml/2006/picture">
+                <pic:pic xmlns:pic="http://schemas.openxmlformats.org/drawingml/2006/picture">
+                  <pic:nvPicPr>
+                    <pic:cNvPr id="0" name=""/>
+                    <pic:cNvPicPr/>
+                  </pic:nvPicPr>
+                  <pic:blipFill>
+                    <a:blip r:embed="rId44"/>
+                    <a:stretch>
+                      <a:fillRect/>
+                    </a:stretch>
+                  </pic:blipFill>
+                  <pic:spPr>
+                    <a:xfrm>
+                      <a:off x="0" y="0"/>
+                      <a:ext cx="6120130" cy="2875937"/>
+                    </a:xfrm>
+                    <a:prstGeom prst="rect">
+                      <a:avLst/>
+                    </a:prstGeom>
+                  </pic:spPr>
+                </pic:pic>
+              </a:graphicData>
+            </a:graphic>
+          </wp:inline>
+        </w:drawing>
+      </w:r>
+    </w:p>
+    <w:p>
+      <w:pPr>
+        <w:spacing w:after="0"/>
+        <w:jc w:val="both"/>
+        <w:rPr>
+          <w:rFonts w:ascii="Times New Roman" w:hAnsi="Times New Roman" w:cs="Times New Roman"/>
+          <w:sz w:val="28"/>
+          <w:szCs w:val="28"/>
+        </w:rPr>
+      </w:pPr>
+      <w:r>
+        <w:rPr>
+          <w:rFonts w:ascii="Times New Roman" w:hAnsi="Times New Roman" w:cs="Times New Roman"/>
+          <w:sz w:val="28"/>
+          <w:szCs w:val="28"/>
+          <w:lang w:val="en-US"/>
+        </w:rPr>
+        <w:tab/>
+      </w:r>
+      <w:r>
+        <w:rPr>
+          <w:rFonts w:ascii="Times New Roman" w:hAnsi="Times New Roman" w:cs="Times New Roman"/>
+          <w:sz w:val="28"/>
+          <w:szCs w:val="28"/>
+        </w:rPr>
+        <w:t>Есть возможность удаления документа из коллекции.</w:t>
+      </w:r>
+      <w:bookmarkStart w:id="6" w:name="_GoBack"/>
       <w:bookmarkEnd w:id="6"/>
     </w:p>
     <w:p>
       <w:pPr>
-        <w:rPr>
-          <w:rFonts w:ascii="Times New Roman" w:eastAsiaTheme="majorEastAsia" w:hAnsi="Times New Roman" w:cs="Times New Roman"/>
-          <w:b/>
-          <w:bCs/>
-          <w:color w:val="000000" w:themeColor="text1"/>
-          <w:sz w:val="36"/>
+        <w:spacing w:after="0"/>
+        <w:ind w:firstLine="708"/>
+        <w:jc w:val="both"/>
+        <w:rPr>
+          <w:rFonts w:ascii="Times New Roman" w:hAnsi="Times New Roman" w:cs="Times New Roman"/>
+          <w:sz w:val="28"/>
+          <w:szCs w:val="28"/>
+        </w:rPr>
+      </w:pPr>
+    </w:p>
+    <w:p>
+      <w:pPr>
+        <w:ind w:firstLine="708"/>
+        <w:jc w:val="both"/>
+        <w:rPr>
+          <w:rFonts w:ascii="Times New Roman" w:hAnsi="Times New Roman" w:cs="Times New Roman"/>
+          <w:sz w:val="28"/>
+          <w:szCs w:val="28"/>
+        </w:rPr>
+      </w:pPr>
+    </w:p>
+    <w:p>
+      <w:pPr>
+        <w:rPr>
+          <w:rFonts w:ascii="Times New Roman" w:hAnsi="Times New Roman" w:cs="Times New Roman"/>
+          <w:sz w:val="28"/>
           <w:szCs w:val="28"/>
         </w:rPr>
       </w:pPr>
@@ -11468,7 +12213,7 @@
           <w:rPr>
             <w:noProof/>
           </w:rPr>
-          <w:t>30</w:t>
+          <w:t>33</w:t>
         </w:r>
         <w:r>
           <w:fldChar w:fldCharType="end"/>
@@ -11974,7 +12719,7 @@
   <w:style w:type="paragraph" w:default="1" w:styleId="a">
     <w:name w:val="Normal"/>
     <w:qFormat/>
-    <w:rsid w:val="00070FDD"/>
+    <w:rsid w:val="008066C8"/>
   </w:style>
   <w:style w:type="paragraph" w:styleId="1">
     <w:name w:val="heading 1"/>
@@ -12381,7 +13126,7 @@
   <w:style w:type="paragraph" w:default="1" w:styleId="a">
     <w:name w:val="Normal"/>
     <w:qFormat/>
-    <w:rsid w:val="00070FDD"/>
+    <w:rsid w:val="008066C8"/>
   </w:style>
   <w:style w:type="paragraph" w:styleId="1">
     <w:name w:val="heading 1"/>
@@ -12919,7 +13664,7 @@
 </file>
 
 <file path=customXml/itemProps1.xml><?xml version="1.0" encoding="utf-8"?>
-<ds:datastoreItem xmlns:ds="http://schemas.openxmlformats.org/officeDocument/2006/customXml" ds:itemID="{0ADE9B35-0655-40DC-A4D9-404E30916B90}">
+<ds:datastoreItem xmlns:ds="http://schemas.openxmlformats.org/officeDocument/2006/customXml" ds:itemID="{06C4B9EC-C4A7-4889-B2C3-2EA51CF7E5AB}">
   <ds:schemaRefs>
     <ds:schemaRef ds:uri="http://schemas.openxmlformats.org/officeDocument/2006/bibliography"/>
   </ds:schemaRefs>

</xml_diff>